<commit_message>
make Drag API (need fix)
</commit_message>
<xml_diff>
--- a/Инфа/доработать.docx
+++ b/Инфа/доработать.docx
@@ -4,643 +4,327 @@
   <w:body>
     <w:p>
       <w:pPr>
-        <w:spacing w:before="100" w:beforeAutospacing="1" w:after="100" w:afterAutospacing="1" w:line="240" w:lineRule="auto"/>
         <w:rPr>
-          <w:rFonts w:ascii="Times New Roman" w:eastAsia="Times New Roman" w:hAnsi="Times New Roman" w:cs="Times New Roman"/>
-          <w:kern w:val="0"/>
-          <w:lang w:eastAsia="ru-RU"/>
-          <w14:ligatures w14:val="none"/>
+          <w:lang w:val="en-US"/>
         </w:rPr>
       </w:pPr>
       <w:r>
+        <w:t>Так. Смотри, перемотка идет назад, но увы. Ничего нет. Слушай. Как на счет того, чтобы на таймлайне, если показ дошел до конца последнего видео, вариант того, чтобы кнопка старта паузалась. А после нажатия в конце, она как раз перематывалась назад. В начало, так как все еще ломается видео, но вроде стало лучше. Теперь дорожки, драг энд дроп не работает. Просто блокируется добавлять видео переносом. Плюс, мы можем хватать и двигать видео, но не можем перетаскивать на дорожку два и вообще отпустить.оно багуется и не отпускает, так же выдавая ошибку</w:t>
+      </w:r>
+      <w:r>
+        <w:br/>
+        <w:t>qml: ? Выделен</w:t>
+      </w:r>
+      <w:r>
         <w:rPr>
-          <w:rFonts w:ascii="Times New Roman" w:eastAsia="Times New Roman" w:hAnsi="Times New Roman" w:cs="Times New Roman"/>
-          <w:kern w:val="0"/>
-          <w:lang w:eastAsia="ru-RU"/>
-          <w14:ligatures w14:val="none"/>
+          <w:lang w:val="en-US"/>
         </w:rPr>
-        <w:t xml:space="preserve">Так. Смотри. выделение все равно не работает. Видео не выделяется на левую и не вызывается контекстное меню на правую кнопку мыши. На левую ни </w:t>
-      </w:r>
-      <w:proofErr w:type="gramStart"/>
+        <w:t xml:space="preserve"> </w:t>
+      </w:r>
+      <w:r>
+        <w:t>клип</w:t>
+      </w:r>
       <w:r>
         <w:rPr>
-          <w:rFonts w:ascii="Times New Roman" w:eastAsia="Times New Roman" w:hAnsi="Times New Roman" w:cs="Times New Roman"/>
-          <w:kern w:val="0"/>
-          <w:lang w:eastAsia="ru-RU"/>
-          <w14:ligatures w14:val="none"/>
+          <w:lang w:val="en-US"/>
         </w:rPr>
-        <w:t>перенос</w:t>
-      </w:r>
-      <w:proofErr w:type="gramEnd"/>
-      <w:r>
-        <w:rPr>
-          <w:rFonts w:ascii="Times New Roman" w:eastAsia="Times New Roman" w:hAnsi="Times New Roman" w:cs="Times New Roman"/>
-          <w:kern w:val="0"/>
-          <w:lang w:eastAsia="ru-RU"/>
-          <w14:ligatures w14:val="none"/>
-        </w:rPr>
-        <w:t xml:space="preserve"> ни выделение. Ни че </w:t>
-      </w:r>
-      <w:proofErr w:type="spellStart"/>
-      <w:r>
-        <w:rPr>
-          <w:rFonts w:ascii="Times New Roman" w:eastAsia="Times New Roman" w:hAnsi="Times New Roman" w:cs="Times New Roman"/>
-          <w:kern w:val="0"/>
-          <w:lang w:eastAsia="ru-RU"/>
-          <w14:ligatures w14:val="none"/>
-        </w:rPr>
-        <w:t>го</w:t>
-      </w:r>
-      <w:proofErr w:type="spellEnd"/>
-      <w:r>
-        <w:rPr>
-          <w:rFonts w:ascii="Times New Roman" w:eastAsia="Times New Roman" w:hAnsi="Times New Roman" w:cs="Times New Roman"/>
-          <w:kern w:val="0"/>
-          <w:lang w:eastAsia="ru-RU"/>
-          <w14:ligatures w14:val="none"/>
-        </w:rPr>
-        <w:t xml:space="preserve">. </w:t>
+        <w:t xml:space="preserve"> 0</w:t>
       </w:r>
     </w:p>
     <w:p>
       <w:pPr>
-        <w:spacing w:before="100" w:beforeAutospacing="1" w:after="100" w:afterAutospacing="1" w:line="240" w:lineRule="auto"/>
         <w:rPr>
-          <w:rFonts w:ascii="Times New Roman" w:eastAsia="Times New Roman" w:hAnsi="Times New Roman" w:cs="Times New Roman"/>
-          <w:kern w:val="0"/>
-          <w:lang w:eastAsia="ru-RU"/>
-          <w14:ligatures w14:val="none"/>
+          <w:lang w:val="en-US"/>
         </w:rPr>
       </w:pPr>
       <w:r>
         <w:rPr>
-          <w:rFonts w:ascii="Times New Roman" w:eastAsia="Times New Roman" w:hAnsi="Times New Roman" w:cs="Times New Roman"/>
-          <w:kern w:val="0"/>
-          <w:lang w:eastAsia="ru-RU"/>
-          <w14:ligatures w14:val="none"/>
+          <w:lang w:val="en-US"/>
         </w:rPr>
-        <w:t>при нажатии делит</w:t>
+        <w:t>qrc:/components/VideoClip.qml:268: ReferenceError: grabMouse is not defined</w:t>
       </w:r>
     </w:p>
     <w:p>
       <w:pPr>
-        <w:spacing w:before="100" w:beforeAutospacing="1" w:after="100" w:afterAutospacing="1" w:line="240" w:lineRule="auto"/>
         <w:rPr>
-          <w:rFonts w:ascii="Times New Roman" w:eastAsia="Times New Roman" w:hAnsi="Times New Roman" w:cs="Times New Roman"/>
-          <w:kern w:val="0"/>
-          <w:lang w:val="en-US" w:eastAsia="ru-RU"/>
-          <w14:ligatures w14:val="none"/>
+          <w:lang w:val="en-US"/>
         </w:rPr>
       </w:pPr>
       <w:r>
         <w:rPr>
-          <w:rFonts w:ascii="Times New Roman" w:eastAsia="Times New Roman" w:hAnsi="Times New Roman" w:cs="Times New Roman"/>
-          <w:kern w:val="0"/>
-          <w:lang w:val="en-US" w:eastAsia="ru-RU"/>
-          <w14:ligatures w14:val="none"/>
+          <w:lang w:val="en-US"/>
         </w:rPr>
-        <w:t>qrc:/main.qml:613: ReferenceError: selectionManager is not defined</w:t>
+        <w:t>qrc:/components/VideoClip.qml:277: ReferenceError: ungrabMouse is not defined</w:t>
       </w:r>
     </w:p>
     <w:p>
       <w:pPr>
-        <w:spacing w:before="100" w:beforeAutospacing="1" w:after="100" w:afterAutospacing="1" w:line="240" w:lineRule="auto"/>
         <w:rPr>
-          <w:rFonts w:ascii="Times New Roman" w:eastAsia="Times New Roman" w:hAnsi="Times New Roman" w:cs="Times New Roman"/>
-          <w:kern w:val="0"/>
-          <w:lang w:val="en-US" w:eastAsia="ru-RU"/>
-          <w14:ligatures w14:val="none"/>
+          <w:lang w:val="en-US"/>
         </w:rPr>
       </w:pPr>
       <w:r>
         <w:rPr>
-          <w:rFonts w:ascii="Times New Roman" w:eastAsia="Times New Roman" w:hAnsi="Times New Roman" w:cs="Times New Roman"/>
-          <w:kern w:val="0"/>
-          <w:lang w:val="en-US" w:eastAsia="ru-RU"/>
-          <w14:ligatures w14:val="none"/>
+          <w:lang w:val="en-US"/>
         </w:rPr>
-        <w:t>qrc:/main.qml:613: ReferenceError: selectionManager is not defined</w:t>
+        <w:t xml:space="preserve">qml: ? </w:t>
+      </w:r>
+      <w:r>
+        <w:t>Выделен</w:t>
+      </w:r>
+      <w:r>
+        <w:rPr>
+          <w:lang w:val="en-US"/>
+        </w:rPr>
+        <w:t xml:space="preserve"> </w:t>
+      </w:r>
+      <w:r>
+        <w:t>клип</w:t>
+      </w:r>
+      <w:r>
+        <w:rPr>
+          <w:lang w:val="en-US"/>
+        </w:rPr>
+        <w:t xml:space="preserve"> 0</w:t>
       </w:r>
     </w:p>
     <w:p>
       <w:pPr>
-        <w:spacing w:before="100" w:beforeAutospacing="1" w:after="100" w:afterAutospacing="1" w:line="240" w:lineRule="auto"/>
         <w:rPr>
-          <w:rFonts w:ascii="Times New Roman" w:eastAsia="Times New Roman" w:hAnsi="Times New Roman" w:cs="Times New Roman"/>
-          <w:kern w:val="0"/>
-          <w:lang w:val="en-US" w:eastAsia="ru-RU"/>
-          <w14:ligatures w14:val="none"/>
+          <w:lang w:val="en-US"/>
         </w:rPr>
       </w:pPr>
       <w:r>
         <w:rPr>
-          <w:rFonts w:ascii="Times New Roman" w:eastAsia="Times New Roman" w:hAnsi="Times New Roman" w:cs="Times New Roman"/>
-          <w:kern w:val="0"/>
-          <w:lang w:val="en-US" w:eastAsia="ru-RU"/>
-          <w14:ligatures w14:val="none"/>
+          <w:lang w:val="en-US"/>
         </w:rPr>
-        <w:t>qrc:/main.qml:613: ReferenceError: selectionManager is not defined</w:t>
+        <w:t>qrc:/components/VideoClip.qml:268: ReferenceError: grabMouse is not defined</w:t>
       </w:r>
     </w:p>
     <w:p>
-      <w:pPr>
-        <w:spacing w:before="100" w:beforeAutospacing="1" w:after="100" w:afterAutospacing="1" w:line="240" w:lineRule="auto"/>
+      <w:r>
         <w:rPr>
-          <w:rFonts w:ascii="Times New Roman" w:eastAsia="Times New Roman" w:hAnsi="Times New Roman" w:cs="Times New Roman"/>
-          <w:kern w:val="0"/>
-          <w:lang w:val="en-US" w:eastAsia="ru-RU"/>
-          <w14:ligatures w14:val="none"/>
+          <w:lang w:val="en-US"/>
         </w:rPr>
-      </w:pPr>
+        <w:t>qrc</w:t>
+      </w:r>
+      <w:r>
+        <w:t>:/</w:t>
+      </w:r>
       <w:r>
         <w:rPr>
-          <w:rFonts w:ascii="Times New Roman" w:eastAsia="Times New Roman" w:hAnsi="Times New Roman" w:cs="Times New Roman"/>
-          <w:kern w:val="0"/>
-          <w:lang w:val="en-US" w:eastAsia="ru-RU"/>
-          <w14:ligatures w14:val="none"/>
+          <w:lang w:val="en-US"/>
         </w:rPr>
-        <w:t>qrc:/main.qml:613: ReferenceError: selectionManager is not defined</w:t>
-      </w:r>
-    </w:p>
-    <w:p>
-      <w:pPr>
-        <w:spacing w:before="100" w:beforeAutospacing="1" w:after="100" w:afterAutospacing="1" w:line="240" w:lineRule="auto"/>
+        <w:t>components</w:t>
+      </w:r>
+      <w:r>
+        <w:t>/</w:t>
+      </w:r>
+      <w:r>
         <w:rPr>
-          <w:rFonts w:ascii="Times New Roman" w:eastAsia="Times New Roman" w:hAnsi="Times New Roman" w:cs="Times New Roman"/>
-          <w:kern w:val="0"/>
-          <w:lang w:val="en-US" w:eastAsia="ru-RU"/>
-          <w14:ligatures w14:val="none"/>
+          <w:lang w:val="en-US"/>
         </w:rPr>
-      </w:pPr>
+        <w:t>VideoClip</w:t>
+      </w:r>
+      <w:r>
+        <w:t>.</w:t>
+      </w:r>
       <w:r>
         <w:rPr>
-          <w:rFonts w:ascii="Times New Roman" w:eastAsia="Times New Roman" w:hAnsi="Times New Roman" w:cs="Times New Roman"/>
-          <w:kern w:val="0"/>
-          <w:lang w:val="en-US" w:eastAsia="ru-RU"/>
-          <w14:ligatures w14:val="none"/>
+          <w:lang w:val="en-US"/>
         </w:rPr>
-        <w:t>qrc:/main.qml:613: ReferenceError: selectionManager is not defined</w:t>
-      </w:r>
-    </w:p>
-    <w:p>
-      <w:pPr>
-        <w:spacing w:before="100" w:beforeAutospacing="1" w:after="100" w:afterAutospacing="1" w:line="240" w:lineRule="auto"/>
+        <w:t>qml</w:t>
+      </w:r>
+      <w:r>
+        <w:t xml:space="preserve">:277: </w:t>
+      </w:r>
+      <w:r>
         <w:rPr>
-          <w:rFonts w:ascii="Times New Roman" w:eastAsia="Times New Roman" w:hAnsi="Times New Roman" w:cs="Times New Roman"/>
-          <w:kern w:val="0"/>
-          <w:lang w:eastAsia="ru-RU"/>
-          <w14:ligatures w14:val="none"/>
+          <w:lang w:val="en-US"/>
         </w:rPr>
-      </w:pPr>
+        <w:t>ReferenceError</w:t>
+      </w:r>
+      <w:r>
+        <w:t xml:space="preserve">: </w:t>
+      </w:r>
       <w:r>
         <w:rPr>
-          <w:rFonts w:ascii="Times New Roman" w:eastAsia="Times New Roman" w:hAnsi="Times New Roman" w:cs="Times New Roman"/>
-          <w:kern w:val="0"/>
-          <w:lang w:val="en-US" w:eastAsia="ru-RU"/>
-          <w14:ligatures w14:val="none"/>
+          <w:lang w:val="en-US"/>
         </w:rPr>
-        <w:t xml:space="preserve">qrc:/main.qml:613: ReferenceError: selectionManager is not defined </w:t>
+        <w:t>ungrabMouse</w:t>
+      </w:r>
+      <w:r>
+        <w:t xml:space="preserve"> </w:t>
       </w:r>
       <w:r>
         <w:rPr>
-          <w:rFonts w:ascii="Times New Roman" w:eastAsia="Times New Roman" w:hAnsi="Times New Roman" w:cs="Times New Roman"/>
-          <w:kern w:val="0"/>
-          <w:lang w:eastAsia="ru-RU"/>
-          <w14:ligatures w14:val="none"/>
+          <w:lang w:val="en-US"/>
         </w:rPr>
-        <w:t>тупо</w:t>
+        <w:t>is</w:t>
+      </w:r>
+      <w:r>
+        <w:t xml:space="preserve"> </w:t>
       </w:r>
       <w:r>
         <w:rPr>
-          <w:rFonts w:ascii="Times New Roman" w:eastAsia="Times New Roman" w:hAnsi="Times New Roman" w:cs="Times New Roman"/>
-          <w:kern w:val="0"/>
-          <w:lang w:val="en-US" w:eastAsia="ru-RU"/>
-          <w14:ligatures w14:val="none"/>
+          <w:lang w:val="en-US"/>
         </w:rPr>
+        <w:t>not</w:t>
+      </w:r>
+      <w:r>
         <w:t xml:space="preserve"> </w:t>
       </w:r>
       <w:r>
         <w:rPr>
-          <w:rFonts w:ascii="Times New Roman" w:eastAsia="Times New Roman" w:hAnsi="Times New Roman" w:cs="Times New Roman"/>
-          <w:kern w:val="0"/>
-          <w:lang w:eastAsia="ru-RU"/>
-          <w14:ligatures w14:val="none"/>
+          <w:lang w:val="en-US"/>
         </w:rPr>
-        <w:t>ошибка</w:t>
+        <w:t>defined</w:t>
+      </w:r>
+      <w:r>
+        <w:br/>
+      </w:r>
+      <w:r>
+        <w:t>а</w:t>
+      </w:r>
+      <w:r>
+        <w:t xml:space="preserve"> </w:t>
+      </w:r>
+      <w:r>
+        <w:t>при</w:t>
+      </w:r>
+      <w:r>
+        <w:t xml:space="preserve"> </w:t>
+      </w:r>
+      <w:r>
+        <w:t>удалении</w:t>
+      </w:r>
+      <w:r>
+        <w:t xml:space="preserve"> </w:t>
+      </w:r>
+      <w:r>
+        <w:t>видео</w:t>
+      </w:r>
+      <w:r>
+        <w:t xml:space="preserve"> </w:t>
+      </w:r>
+      <w:r>
+        <w:t>так</w:t>
+      </w:r>
+      <w:r>
+        <w:t xml:space="preserve"> </w:t>
+      </w:r>
+      <w:r>
+        <w:t>и</w:t>
+      </w:r>
+      <w:r>
+        <w:t xml:space="preserve"> </w:t>
+      </w:r>
+      <w:r>
+        <w:t>добавлении</w:t>
+      </w:r>
+      <w:r>
+        <w:t xml:space="preserve"> </w:t>
+      </w:r>
+      <w:r>
+        <w:t>нового</w:t>
+      </w:r>
+      <w:r>
+        <w:t xml:space="preserve">, </w:t>
+      </w:r>
+      <w:r>
+        <w:t>видео</w:t>
+      </w:r>
+      <w:r>
+        <w:t xml:space="preserve"> </w:t>
+      </w:r>
+      <w:r>
+        <w:t>багуется</w:t>
+      </w:r>
+      <w:r>
+        <w:t xml:space="preserve"> </w:t>
+      </w:r>
+      <w:r>
+        <w:t>и</w:t>
+      </w:r>
+      <w:r>
+        <w:t xml:space="preserve"> </w:t>
+      </w:r>
+      <w:r>
+        <w:t>моргает</w:t>
+      </w:r>
+      <w:r>
+        <w:br/>
       </w:r>
       <w:r>
         <w:rPr>
-          <w:rFonts w:ascii="Times New Roman" w:eastAsia="Times New Roman" w:hAnsi="Times New Roman" w:cs="Times New Roman"/>
-          <w:kern w:val="0"/>
-          <w:lang w:val="en-US" w:eastAsia="ru-RU"/>
-          <w14:ligatures w14:val="none"/>
+          <w:lang w:val="en-US"/>
         </w:rPr>
-        <w:t xml:space="preserve">. </w:t>
-      </w:r>
-      <w:r>
-        <w:rPr>
-          <w:rFonts w:ascii="Times New Roman" w:eastAsia="Times New Roman" w:hAnsi="Times New Roman" w:cs="Times New Roman"/>
-          <w:kern w:val="0"/>
-          <w:lang w:eastAsia="ru-RU"/>
-          <w14:ligatures w14:val="none"/>
-        </w:rPr>
-        <w:t>Не работает</w:t>
-      </w:r>
-    </w:p>
-    <w:p>
-      <w:pPr>
-        <w:spacing w:before="100" w:beforeAutospacing="1" w:after="100" w:afterAutospacing="1" w:line="240" w:lineRule="auto"/>
-        <w:rPr>
-          <w:rFonts w:ascii="Times New Roman" w:eastAsia="Times New Roman" w:hAnsi="Times New Roman" w:cs="Times New Roman"/>
-          <w:kern w:val="0"/>
-          <w:lang w:eastAsia="ru-RU"/>
-          <w14:ligatures w14:val="none"/>
-        </w:rPr>
-      </w:pPr>
-      <w:r>
-        <w:rPr>
-          <w:rFonts w:ascii="Times New Roman" w:eastAsia="Times New Roman" w:hAnsi="Times New Roman" w:cs="Times New Roman"/>
-          <w:kern w:val="0"/>
-          <w:lang w:eastAsia="ru-RU"/>
-          <w14:ligatures w14:val="none"/>
-        </w:rPr>
-        <w:t xml:space="preserve">Далее, все равно когда на </w:t>
-      </w:r>
-      <w:proofErr w:type="spellStart"/>
-      <w:r>
-        <w:rPr>
-          <w:rFonts w:ascii="Times New Roman" w:eastAsia="Times New Roman" w:hAnsi="Times New Roman" w:cs="Times New Roman"/>
-          <w:kern w:val="0"/>
-          <w:lang w:eastAsia="ru-RU"/>
-          <w14:ligatures w14:val="none"/>
-        </w:rPr>
-        <w:t>таймлайне</w:t>
-      </w:r>
-      <w:proofErr w:type="spellEnd"/>
-      <w:r>
-        <w:rPr>
-          <w:rFonts w:ascii="Times New Roman" w:eastAsia="Times New Roman" w:hAnsi="Times New Roman" w:cs="Times New Roman"/>
-          <w:kern w:val="0"/>
-          <w:lang w:eastAsia="ru-RU"/>
-          <w14:ligatures w14:val="none"/>
-        </w:rPr>
-        <w:t xml:space="preserve"> прошли по всем видео, и все, больше смотреть не </w:t>
-      </w:r>
-      <w:proofErr w:type="spellStart"/>
-      <w:proofErr w:type="gramStart"/>
-      <w:r>
-        <w:rPr>
-          <w:rFonts w:ascii="Times New Roman" w:eastAsia="Times New Roman" w:hAnsi="Times New Roman" w:cs="Times New Roman"/>
-          <w:kern w:val="0"/>
-          <w:lang w:eastAsia="ru-RU"/>
-          <w14:ligatures w14:val="none"/>
-        </w:rPr>
-        <w:t>возможно.ни</w:t>
-      </w:r>
-      <w:proofErr w:type="spellEnd"/>
-      <w:proofErr w:type="gramEnd"/>
-      <w:r>
-        <w:rPr>
-          <w:rFonts w:ascii="Times New Roman" w:eastAsia="Times New Roman" w:hAnsi="Times New Roman" w:cs="Times New Roman"/>
-          <w:kern w:val="0"/>
-          <w:lang w:eastAsia="ru-RU"/>
-          <w14:ligatures w14:val="none"/>
-        </w:rPr>
-        <w:t xml:space="preserve"> при перемотке, ни при старте вообще никак. Только </w:t>
-      </w:r>
-      <w:proofErr w:type="spellStart"/>
-      <w:r>
-        <w:rPr>
-          <w:rFonts w:ascii="Times New Roman" w:eastAsia="Times New Roman" w:hAnsi="Times New Roman" w:cs="Times New Roman"/>
-          <w:kern w:val="0"/>
-          <w:lang w:eastAsia="ru-RU"/>
-          <w14:ligatures w14:val="none"/>
-        </w:rPr>
+        <w:drawing>
+          <wp:inline distT="0" distB="0" distL="0" distR="0" wp14:anchorId="5FA98222" wp14:editId="50363688">
+            <wp:extent cx="5940425" cy="4177030"/>
+            <wp:effectExtent l="0" t="0" r="3175" b="0"/>
+            <wp:docPr id="1" name="Рисунок 1"/>
+            <wp:cNvGraphicFramePr>
+              <a:graphicFrameLocks xmlns:a="http://schemas.openxmlformats.org/drawingml/2006/main" noChangeAspect="1"/>
+            </wp:cNvGraphicFramePr>
+            <a:graphic xmlns:a="http://schemas.openxmlformats.org/drawingml/2006/main">
+              <a:graphicData uri="http://schemas.openxmlformats.org/drawingml/2006/picture">
+                <pic:pic xmlns:pic="http://schemas.openxmlformats.org/drawingml/2006/picture">
+                  <pic:nvPicPr>
+                    <pic:cNvPr id="1" name=""/>
+                    <pic:cNvPicPr/>
+                  </pic:nvPicPr>
+                  <pic:blipFill>
+                    <a:blip r:embed="rId5"/>
+                    <a:stretch>
+                      <a:fillRect/>
+                    </a:stretch>
+                  </pic:blipFill>
+                  <pic:spPr>
+                    <a:xfrm>
+                      <a:off x="0" y="0"/>
+                      <a:ext cx="5940425" cy="4177030"/>
+                    </a:xfrm>
+                    <a:prstGeom prst="rect">
+                      <a:avLst/>
+                    </a:prstGeom>
+                  </pic:spPr>
+                </pic:pic>
+              </a:graphicData>
+            </a:graphic>
+          </wp:inline>
+        </w:drawing>
+      </w:r>
+      <w:r>
+        <w:br/>
+      </w:r>
+      <w:r>
+        <w:t>мне</w:t>
+      </w:r>
+      <w:r>
+        <w:t xml:space="preserve"> </w:t>
+      </w:r>
+      <w:r>
+        <w:t>кажется</w:t>
+      </w:r>
+      <w:r>
+        <w:t xml:space="preserve"> </w:t>
+      </w:r>
+      <w:r>
         <w:t>изза</w:t>
       </w:r>
-      <w:proofErr w:type="spellEnd"/>
-      <w:r>
-        <w:rPr>
-          <w:rFonts w:ascii="Times New Roman" w:eastAsia="Times New Roman" w:hAnsi="Times New Roman" w:cs="Times New Roman"/>
-          <w:kern w:val="0"/>
-          <w:lang w:eastAsia="ru-RU"/>
-          <w14:ligatures w14:val="none"/>
-        </w:rPr>
-        <w:t xml:space="preserve"> того, что дошли до конца </w:t>
-      </w:r>
-      <w:proofErr w:type="spellStart"/>
-      <w:r>
-        <w:rPr>
-          <w:rFonts w:ascii="Times New Roman" w:eastAsia="Times New Roman" w:hAnsi="Times New Roman" w:cs="Times New Roman"/>
-          <w:kern w:val="0"/>
-          <w:lang w:eastAsia="ru-RU"/>
-          <w14:ligatures w14:val="none"/>
-        </w:rPr>
-        <w:t>таймлайна</w:t>
-      </w:r>
-      <w:proofErr w:type="spellEnd"/>
-      <w:r>
-        <w:rPr>
-          <w:rFonts w:ascii="Times New Roman" w:eastAsia="Times New Roman" w:hAnsi="Times New Roman" w:cs="Times New Roman"/>
-          <w:kern w:val="0"/>
-          <w:lang w:eastAsia="ru-RU"/>
-          <w14:ligatures w14:val="none"/>
-        </w:rPr>
-        <w:t xml:space="preserve"> или если принципиально тыкать в конец видео любого, даже не последнего. вот есть идея, костыль конечно, но все же. Вот что думаю, если нет более элегантного способа, можно попробовать на эту кнопку (изображение 1) сбрасывать </w:t>
-      </w:r>
-      <w:proofErr w:type="spellStart"/>
-      <w:r>
-        <w:rPr>
-          <w:rFonts w:ascii="Times New Roman" w:eastAsia="Times New Roman" w:hAnsi="Times New Roman" w:cs="Times New Roman"/>
-          <w:kern w:val="0"/>
-          <w:lang w:eastAsia="ru-RU"/>
-          <w14:ligatures w14:val="none"/>
-        </w:rPr>
-        <w:t>таймлайн</w:t>
-      </w:r>
-      <w:proofErr w:type="spellEnd"/>
-      <w:r>
-        <w:rPr>
-          <w:rFonts w:ascii="Times New Roman" w:eastAsia="Times New Roman" w:hAnsi="Times New Roman" w:cs="Times New Roman"/>
-          <w:kern w:val="0"/>
-          <w:lang w:eastAsia="ru-RU"/>
-          <w14:ligatures w14:val="none"/>
-        </w:rPr>
-        <w:t xml:space="preserve"> и стартовать по новой? Просто </w:t>
-      </w:r>
-      <w:proofErr w:type="spellStart"/>
-      <w:r>
-        <w:rPr>
-          <w:rFonts w:ascii="Times New Roman" w:eastAsia="Times New Roman" w:hAnsi="Times New Roman" w:cs="Times New Roman"/>
-          <w:kern w:val="0"/>
-          <w:lang w:eastAsia="ru-RU"/>
-          <w14:ligatures w14:val="none"/>
-        </w:rPr>
-        <w:t>хз</w:t>
-      </w:r>
-      <w:proofErr w:type="spellEnd"/>
-      <w:r>
-        <w:rPr>
-          <w:rFonts w:ascii="Times New Roman" w:eastAsia="Times New Roman" w:hAnsi="Times New Roman" w:cs="Times New Roman"/>
-          <w:kern w:val="0"/>
-          <w:lang w:eastAsia="ru-RU"/>
-          <w14:ligatures w14:val="none"/>
-        </w:rPr>
-        <w:t xml:space="preserve">, я не имею идей как </w:t>
-      </w:r>
-      <w:proofErr w:type="spellStart"/>
-      <w:r>
-        <w:rPr>
-          <w:rFonts w:ascii="Times New Roman" w:eastAsia="Times New Roman" w:hAnsi="Times New Roman" w:cs="Times New Roman"/>
-          <w:kern w:val="0"/>
-          <w:lang w:eastAsia="ru-RU"/>
-          <w14:ligatures w14:val="none"/>
-        </w:rPr>
-        <w:t>эт</w:t>
-      </w:r>
-      <w:proofErr w:type="spellEnd"/>
-      <w:r>
-        <w:rPr>
-          <w:rFonts w:ascii="Times New Roman" w:eastAsia="Times New Roman" w:hAnsi="Times New Roman" w:cs="Times New Roman"/>
-          <w:kern w:val="0"/>
-          <w:lang w:eastAsia="ru-RU"/>
-          <w14:ligatures w14:val="none"/>
-        </w:rPr>
+      <w:r>
         <w:t xml:space="preserve"> </w:t>
       </w:r>
-      <w:proofErr w:type="spellStart"/>
-      <w:r>
-        <w:rPr>
-          <w:rFonts w:ascii="Times New Roman" w:eastAsia="Times New Roman" w:hAnsi="Times New Roman" w:cs="Times New Roman"/>
-          <w:kern w:val="0"/>
-          <w:lang w:eastAsia="ru-RU"/>
-          <w14:ligatures w14:val="none"/>
-        </w:rPr>
-        <w:t>опочинить</w:t>
-      </w:r>
-      <w:proofErr w:type="spellEnd"/>
-      <w:r>
-        <w:rPr>
-          <w:rFonts w:ascii="Times New Roman" w:eastAsia="Times New Roman" w:hAnsi="Times New Roman" w:cs="Times New Roman"/>
-          <w:kern w:val="0"/>
-          <w:lang w:eastAsia="ru-RU"/>
-          <w14:ligatures w14:val="none"/>
-        </w:rPr>
-        <w:t>, но это надо починить</w:t>
-      </w:r>
-    </w:p>
-    <w:p>
-      <w:pPr>
-        <w:spacing w:before="100" w:beforeAutospacing="1" w:after="100" w:afterAutospacing="1" w:line="240" w:lineRule="auto"/>
-        <w:rPr>
-          <w:rFonts w:ascii="Times New Roman" w:eastAsia="Times New Roman" w:hAnsi="Times New Roman" w:cs="Times New Roman"/>
-          <w:kern w:val="0"/>
-          <w:lang w:eastAsia="ru-RU"/>
-          <w14:ligatures w14:val="none"/>
-        </w:rPr>
-      </w:pPr>
-      <w:r>
-        <w:rPr>
-          <w:rFonts w:ascii="Times New Roman" w:eastAsia="Times New Roman" w:hAnsi="Times New Roman" w:cs="Times New Roman"/>
-          <w:kern w:val="0"/>
-          <w:lang w:eastAsia="ru-RU"/>
-          <w14:ligatures w14:val="none"/>
-        </w:rPr>
-        <w:t xml:space="preserve">Далее. Если смотреть видео на </w:t>
-      </w:r>
-      <w:proofErr w:type="spellStart"/>
-      <w:r>
-        <w:rPr>
-          <w:rFonts w:ascii="Times New Roman" w:eastAsia="Times New Roman" w:hAnsi="Times New Roman" w:cs="Times New Roman"/>
-          <w:kern w:val="0"/>
-          <w:lang w:eastAsia="ru-RU"/>
-          <w14:ligatures w14:val="none"/>
-        </w:rPr>
-        <w:t>таймлане</w:t>
-      </w:r>
-      <w:proofErr w:type="spellEnd"/>
-      <w:r>
-        <w:rPr>
-          <w:rFonts w:ascii="Times New Roman" w:eastAsia="Times New Roman" w:hAnsi="Times New Roman" w:cs="Times New Roman"/>
-          <w:kern w:val="0"/>
-          <w:lang w:eastAsia="ru-RU"/>
-          <w14:ligatures w14:val="none"/>
-        </w:rPr>
-        <w:t xml:space="preserve">, все хорошо, идет до конца, но </w:t>
-      </w:r>
-      <w:proofErr w:type="gramStart"/>
-      <w:r>
-        <w:rPr>
-          <w:rFonts w:ascii="Times New Roman" w:eastAsia="Times New Roman" w:hAnsi="Times New Roman" w:cs="Times New Roman"/>
-          <w:kern w:val="0"/>
-          <w:lang w:eastAsia="ru-RU"/>
-          <w14:ligatures w14:val="none"/>
-        </w:rPr>
-        <w:t>потом</w:t>
-      </w:r>
-      <w:proofErr w:type="gramEnd"/>
-      <w:r>
-        <w:rPr>
-          <w:rFonts w:ascii="Times New Roman" w:eastAsia="Times New Roman" w:hAnsi="Times New Roman" w:cs="Times New Roman"/>
-          <w:kern w:val="0"/>
-          <w:lang w:eastAsia="ru-RU"/>
-          <w14:ligatures w14:val="none"/>
-        </w:rPr>
-        <w:t xml:space="preserve"> когда дошли до конца видео (пример изображение 2. Не </w:t>
-      </w:r>
-      <w:proofErr w:type="spellStart"/>
-      <w:r>
-        <w:rPr>
-          <w:rFonts w:ascii="Times New Roman" w:eastAsia="Times New Roman" w:hAnsi="Times New Roman" w:cs="Times New Roman"/>
-          <w:kern w:val="0"/>
-          <w:lang w:eastAsia="ru-RU"/>
-          <w14:ligatures w14:val="none"/>
-        </w:rPr>
-        <w:t>удиаляйся</w:t>
-      </w:r>
-      <w:proofErr w:type="spellEnd"/>
-      <w:r>
-        <w:rPr>
-          <w:rFonts w:ascii="Times New Roman" w:eastAsia="Times New Roman" w:hAnsi="Times New Roman" w:cs="Times New Roman"/>
-          <w:kern w:val="0"/>
-          <w:lang w:eastAsia="ru-RU"/>
-          <w14:ligatures w14:val="none"/>
-        </w:rPr>
-        <w:t xml:space="preserve">, я просто резал видео. </w:t>
-      </w:r>
-      <w:proofErr w:type="gramStart"/>
-      <w:r>
-        <w:rPr>
-          <w:rFonts w:ascii="Times New Roman" w:eastAsia="Times New Roman" w:hAnsi="Times New Roman" w:cs="Times New Roman"/>
-          <w:kern w:val="0"/>
-          <w:lang w:eastAsia="ru-RU"/>
-          <w14:ligatures w14:val="none"/>
-        </w:rPr>
-        <w:t>так то</w:t>
-      </w:r>
-      <w:proofErr w:type="gramEnd"/>
-      <w:r>
-        <w:rPr>
-          <w:rFonts w:ascii="Times New Roman" w:eastAsia="Times New Roman" w:hAnsi="Times New Roman" w:cs="Times New Roman"/>
-          <w:kern w:val="0"/>
-          <w:lang w:eastAsia="ru-RU"/>
-          <w14:ligatures w14:val="none"/>
-        </w:rPr>
-        <w:t xml:space="preserve"> оно целое) так вот, мы доходим до конца и показ красный </w:t>
-      </w:r>
-      <w:proofErr w:type="spellStart"/>
-      <w:r>
-        <w:rPr>
-          <w:rFonts w:ascii="Times New Roman" w:eastAsia="Times New Roman" w:hAnsi="Times New Roman" w:cs="Times New Roman"/>
-          <w:kern w:val="0"/>
-          <w:lang w:eastAsia="ru-RU"/>
-          <w14:ligatures w14:val="none"/>
-        </w:rPr>
-        <w:t>таймлайнв</w:t>
-      </w:r>
-      <w:proofErr w:type="spellEnd"/>
-      <w:r>
-        <w:rPr>
-          <w:rFonts w:ascii="Times New Roman" w:eastAsia="Times New Roman" w:hAnsi="Times New Roman" w:cs="Times New Roman"/>
-          <w:kern w:val="0"/>
-          <w:lang w:eastAsia="ru-RU"/>
-          <w14:ligatures w14:val="none"/>
-        </w:rPr>
-        <w:t xml:space="preserve"> начинается с начала, но видео показывается новое. Если нажать паузу потом старт, конечно все </w:t>
-      </w:r>
-      <w:proofErr w:type="spellStart"/>
-      <w:r>
-        <w:rPr>
-          <w:rFonts w:ascii="Times New Roman" w:eastAsia="Times New Roman" w:hAnsi="Times New Roman" w:cs="Times New Roman"/>
-          <w:kern w:val="0"/>
-          <w:lang w:eastAsia="ru-RU"/>
-          <w14:ligatures w14:val="none"/>
-        </w:rPr>
-        <w:t>сбрасывется</w:t>
-      </w:r>
-      <w:proofErr w:type="spellEnd"/>
-      <w:r>
-        <w:rPr>
-          <w:rFonts w:ascii="Times New Roman" w:eastAsia="Times New Roman" w:hAnsi="Times New Roman" w:cs="Times New Roman"/>
-          <w:kern w:val="0"/>
-          <w:lang w:eastAsia="ru-RU"/>
-          <w14:ligatures w14:val="none"/>
-        </w:rPr>
-        <w:t xml:space="preserve"> и показывается первое видео, но оно же должно идти дальше. При чем перемотки все работает все хорошо. Да и при просмотре так видео, красная полоска пытается быстрее </w:t>
-      </w:r>
-      <w:proofErr w:type="spellStart"/>
-      <w:r>
-        <w:rPr>
-          <w:rFonts w:ascii="Times New Roman" w:eastAsia="Times New Roman" w:hAnsi="Times New Roman" w:cs="Times New Roman"/>
-          <w:kern w:val="0"/>
-          <w:lang w:eastAsia="ru-RU"/>
-          <w14:ligatures w14:val="none"/>
-        </w:rPr>
-        <w:t>быстрее</w:t>
-      </w:r>
-      <w:proofErr w:type="spellEnd"/>
-      <w:r>
-        <w:rPr>
-          <w:rFonts w:ascii="Times New Roman" w:eastAsia="Times New Roman" w:hAnsi="Times New Roman" w:cs="Times New Roman"/>
-          <w:kern w:val="0"/>
-          <w:lang w:eastAsia="ru-RU"/>
-          <w14:ligatures w14:val="none"/>
-        </w:rPr>
-        <w:t xml:space="preserve"> вернутся на </w:t>
-      </w:r>
-      <w:proofErr w:type="spellStart"/>
-      <w:r>
-        <w:rPr>
-          <w:rFonts w:ascii="Times New Roman" w:eastAsia="Times New Roman" w:hAnsi="Times New Roman" w:cs="Times New Roman"/>
-          <w:kern w:val="0"/>
-          <w:lang w:eastAsia="ru-RU"/>
-          <w14:ligatures w14:val="none"/>
-        </w:rPr>
-        <w:t>таймлайн</w:t>
-      </w:r>
-      <w:proofErr w:type="spellEnd"/>
-    </w:p>
-    <w:p>
-      <w:pPr>
-        <w:spacing w:before="100" w:beforeAutospacing="1" w:after="100" w:afterAutospacing="1" w:line="240" w:lineRule="auto"/>
-        <w:rPr>
-          <w:rFonts w:ascii="Times New Roman" w:eastAsia="Times New Roman" w:hAnsi="Times New Roman" w:cs="Times New Roman"/>
-          <w:kern w:val="0"/>
-          <w:lang w:eastAsia="ru-RU"/>
-          <w14:ligatures w14:val="none"/>
-        </w:rPr>
-      </w:pPr>
-      <w:r>
-        <w:rPr>
-          <w:rFonts w:ascii="Times New Roman" w:eastAsia="Times New Roman" w:hAnsi="Times New Roman" w:cs="Times New Roman"/>
-          <w:kern w:val="0"/>
-          <w:lang w:eastAsia="ru-RU"/>
-          <w14:ligatures w14:val="none"/>
-        </w:rPr>
-        <w:t xml:space="preserve">вот </w:t>
-      </w:r>
-      <w:proofErr w:type="spellStart"/>
-      <w:r>
-        <w:rPr>
-          <w:rFonts w:ascii="Times New Roman" w:eastAsia="Times New Roman" w:hAnsi="Times New Roman" w:cs="Times New Roman"/>
-          <w:kern w:val="0"/>
-          <w:lang w:eastAsia="ru-RU"/>
-          <w14:ligatures w14:val="none"/>
-        </w:rPr>
-        <w:t>както</w:t>
-      </w:r>
-      <w:proofErr w:type="spellEnd"/>
-      <w:r>
-        <w:rPr>
-          <w:rFonts w:ascii="Times New Roman" w:eastAsia="Times New Roman" w:hAnsi="Times New Roman" w:cs="Times New Roman"/>
-          <w:kern w:val="0"/>
-          <w:lang w:eastAsia="ru-RU"/>
-          <w14:ligatures w14:val="none"/>
-        </w:rPr>
-        <w:t xml:space="preserve"> так</w:t>
-      </w:r>
-    </w:p>
-    <w:p>
+      <w:r>
+        <w:t>обновления</w:t>
+      </w:r>
+      <w:r>
+        <w:t xml:space="preserve"> </w:t>
+      </w:r>
+      <w:r>
+        <w:t>и попыток начать, но выделения не сбрасывается</w:t>
+      </w:r>
       <w:bookmarkStart w:id="0" w:name="_GoBack"/>
       <w:bookmarkEnd w:id="0"/>
     </w:p>

</xml_diff>